<commit_message>
docs: record the committed and tagged state, and the publish procedure
Two sentences in TEST-REPORT still described the repository as uncommitted and
untracked, which stopped being true the moment v1.0.0 was tagged. The report is
shipped inside the release artifact, so a stale claim there becomes a claim
about the published package. Publishing commands go in CONTRIBUTING because the
repository's public URL is the owner's to fill in, not something a script here
should guess.
</commit_message>
<xml_diff>
--- a/docs/TEST-REPORT.docx
+++ b/docs/TEST-REPORT.docx
@@ -75,17 +75,38 @@
       </w:r>
       <w:r>
         <w:rPr/>
-        <w:t xml:space="preserve">（按规范"未经明确授权不提交"，本地 </w:t>
+        <w:t xml:space="preserve">。各轮报告的提交状态以 §7.6 结尾为准：补充规范与开源发布这两轮</w:t>
       </w:r>
       <w:r>
         <w:rPr>
           <w:b/>
         </w:rPr>
-        <w:t xml:space="preserve">0 个 commit</w:t>
-      </w:r>
-      <w:r>
-        <w:rPr/>
-        <w:t xml:space="preserve">，未推送、未打标签、未发布版本）</w:t>
+        <w:t xml:space="preserve">经用户明确授权后</w:t>
+      </w:r>
+      <w:r>
+        <w:rPr/>
+        <w:t xml:space="preserve">建立了本地提交与注解标签 </w:t>
+      </w:r>
+      <w:r>
+        <w:rPr>
+          <w:rFonts w:ascii="Consolas" w:hAnsi="Consolas"/>
+          <w:sz w:val="19"/>
+        </w:rPr>
+        <w:t xml:space="preserve">v1.0.0</w:t>
+      </w:r>
+      <w:r>
+        <w:rPr/>
+        <w:t xml:space="preserve">；</w:t>
+      </w:r>
+      <w:r>
+        <w:rPr>
+          <w:b/>
+        </w:rPr>
+        <w:t xml:space="preserve">建仓与推送由执行人自己做</w:t>
+      </w:r>
+      <w:r>
+        <w:rPr/>
+        <w:t xml:space="preserve">（他选的正是"只做本地 commit + tag"）。在此之前，本报告写作时仓库为 0 commit、全部路径 untracked。</w:t>
       </w:r>
     </w:p>
     <w:p>
@@ -11319,28 +11340,180 @@
       <w:pPr/>
       <w:r>
         <w:rPr/>
-        <w:t xml:space="preserve">仓库仍是</w:t>
-      </w:r>
+        <w:t xml:space="preserve">版本状态：本轮经用户明确授权后在本地建立 </w:t>
+      </w:r>
+      <w:r>
+        <w:rPr>
+          <w:rFonts w:ascii="Consolas" w:hAnsi="Consolas"/>
+          <w:sz w:val="19"/>
+        </w:rPr>
+        <w:t xml:space="preserve">chore → feat → test → docs</w:t>
+      </w:r>
+      <w:r>
+        <w:rPr/>
+        <w:t xml:space="preserve"> 四条主提交，再加一条把本段状态写回报告的 </w:t>
+      </w:r>
+      <w:r>
+        <w:rPr>
+          <w:rFonts w:ascii="Consolas" w:hAnsi="Consolas"/>
+          <w:sz w:val="19"/>
+        </w:rPr>
+        <w:t xml:space="preserve">docs</w:t>
+      </w:r>
+      <w:r>
+        <w:rPr/>
+        <w:t xml:space="preserve"> 提交，</w:t>
+      </w:r>
+    </w:p>
+    <w:p>
+      <w:pPr/>
+      <w:r>
+        <w:rPr/>
+        <w:t xml:space="preserve">注解标签 </w:t>
+      </w:r>
+      <w:r>
+        <w:rPr>
+          <w:rFonts w:ascii="Consolas" w:hAnsi="Consolas"/>
+          <w:sz w:val="19"/>
+        </w:rPr>
+        <w:t xml:space="preserve">v1.0.0</w:t>
+      </w:r>
+      <w:r>
+        <w:rPr/>
+        <w:t xml:space="preserve"> 打在最后这一条上（每条都用显式路径 </w:t>
+      </w:r>
+      <w:r>
+        <w:rPr>
+          <w:rFonts w:ascii="Consolas" w:hAnsi="Consolas"/>
+          <w:sz w:val="19"/>
+        </w:rPr>
+        <w:t xml:space="preserve">git add</w:t>
+      </w:r>
+      <w:r>
+        <w:rPr/>
+        <w:t xml:space="preserve">，索引里不含 </w:t>
+      </w:r>
+      <w:r>
+        <w:rPr>
+          <w:rFonts w:ascii="Consolas" w:hAnsi="Consolas"/>
+          <w:sz w:val="19"/>
+        </w:rPr>
+        <w:t xml:space="preserve">data/</w:t>
+      </w:r>
+      <w:r>
+        <w:rPr/>
+        <w:t xml:space="preserve">、</w:t>
+      </w:r>
+      <w:r>
+        <w:rPr>
+          <w:rFonts w:ascii="Consolas" w:hAnsi="Consolas"/>
+          <w:sz w:val="19"/>
+        </w:rPr>
+        <w:t xml:space="preserve">release/</w:t>
+      </w:r>
+      <w:r>
+        <w:rPr/>
+        <w:t xml:space="preserve">、</w:t>
+      </w:r>
+      <w:r>
+        <w:rPr>
+          <w:rFonts w:ascii="Consolas" w:hAnsi="Consolas"/>
+          <w:sz w:val="19"/>
+        </w:rPr>
+        <w:t xml:space="preserve">scratch/</w:t>
+      </w:r>
+      <w:r>
+        <w:rPr/>
+        <w:t xml:space="preserve">、日志或数据库文件）。</w:t>
+      </w:r>
+    </w:p>
+    <w:p>
+      <w:pPr/>
       <w:r>
         <w:rPr>
           <w:b/>
         </w:rPr>
-        <w:t xml:space="preserve">未提交、未推送、未打标签</w:t>
-      </w:r>
-      <w:r>
-        <w:rPr/>
-        <w:t xml:space="preserve">（</w:t>
-      </w:r>
-      <w:r>
-        <w:rPr>
-          <w:rFonts w:ascii="Consolas" w:hAnsi="Consolas"/>
-          <w:sz w:val="19"/>
-        </w:rPr>
-        <w:t xml:space="preserve">git status</w:t>
-      </w:r>
-      <w:r>
-        <w:rPr/>
-        <w:t xml:space="preserve">：所有路径 untracked），按规范"未经明确授权不提交"。</w:t>
+        <w:t xml:space="preserve">建仓与推送仍留给执行人</w:t>
+      </w:r>
+      <w:r>
+        <w:rPr/>
+        <w:t xml:space="preserve">（他选的是"只做本地 commit + tag"）；命令见 </w:t>
+      </w:r>
+      <w:r>
+        <w:rPr>
+          <w:rFonts w:ascii="Consolas" w:hAnsi="Consolas"/>
+          <w:sz w:val="19"/>
+        </w:rPr>
+        <w:t xml:space="preserve">CONTRIBUTING.md</w:t>
+      </w:r>
+      <w:r>
+        <w:rPr/>
+        <w:t xml:space="preserve"> 的</w:t>
+      </w:r>
+    </w:p>
+    <w:p>
+      <w:pPr/>
+      <w:r>
+        <w:rPr/>
+        <w:t xml:space="preserve">"Publishing to GitHub"，其中 </w:t>
+      </w:r>
+      <w:r>
+        <w:rPr>
+          <w:rFonts w:ascii="Consolas" w:hAnsi="Consolas"/>
+          <w:sz w:val="19"/>
+        </w:rPr>
+        <w:t xml:space="preserve">package.json</w:t>
+      </w:r>
+      <w:r>
+        <w:rPr/>
+        <w:t xml:space="preserve"> 的 </w:t>
+      </w:r>
+      <w:r>
+        <w:rPr>
+          <w:rFonts w:ascii="Consolas" w:hAnsi="Consolas"/>
+          <w:sz w:val="19"/>
+        </w:rPr>
+        <w:t xml:space="preserve">repository</w:t>
+      </w:r>
+      <w:r>
+        <w:rPr/>
+        <w:t xml:space="preserve">/</w:t>
+      </w:r>
+      <w:r>
+        <w:rPr>
+          <w:rFonts w:ascii="Consolas" w:hAnsi="Consolas"/>
+          <w:sz w:val="19"/>
+        </w:rPr>
+        <w:t xml:space="preserve">homepage</w:t>
+      </w:r>
+      <w:r>
+        <w:rPr/>
+        <w:t xml:space="preserve">/</w:t>
+      </w:r>
+      <w:r>
+        <w:rPr>
+          <w:rFonts w:ascii="Consolas" w:hAnsi="Consolas"/>
+          <w:sz w:val="19"/>
+        </w:rPr>
+        <w:t xml:space="preserve">bugs</w:t>
+      </w:r>
+      <w:r>
+        <w:rPr/>
+        <w:t xml:space="preserve"> 三格要由所有者填自己的公开地址，</w:t>
+      </w:r>
+    </w:p>
+    <w:p>
+      <w:pPr/>
+      <w:r>
+        <w:rPr/>
+        <w:t xml:space="preserve">本报告与脚本都不替他猜 URL。</w:t>
+      </w:r>
+    </w:p>
+    <w:p>
+      <w:pPr/>
+      <w:r>
+        <w:rPr/>
+        <w:t xml:space="preserve">本报告之前各轮所写的"未提交、未打标签"是当时的状态，不是现在的。</w:t>
       </w:r>
     </w:p>
     <w:sectPr>

</xml_diff>

<commit_message>
docs: separate the certified build from the shipped build
The table's B1 lane runs npm run build itself, so the working .next/ and dist/ that
the final docs-only repackage staged are a later compile of the same source stamp
than the one whose build-info the report quoted. Saying the artifact and the certified
package share a tree is true; implying they share bytes is not, and a report that
ships inside the package has to keep those two claims apart.
</commit_message>
<xml_diff>
--- a/docs/TEST-REPORT.docx
+++ b/docs/TEST-REPORT.docx
@@ -214,8 +214,11 @@
       <w:pPr/>
       <w:r>
         <w:rPr/>
-        <w:t xml:space="preserve">判定对象是交付包本体：</w:t>
-      </w:r>
+        <w:t xml:space="preserve">判定对象是那一次台面所用的整包（交付前"只重拷文档"的再打包与它的差别见 §7.6 末）：</w:t>
+      </w:r>
+    </w:p>
+    <w:p>
+      <w:pPr/>
       <w:r>
         <w:rPr>
           <w:rFonts w:ascii="Consolas" w:hAnsi="Consolas"/>
@@ -11062,7 +11065,14 @@
       </w:r>
       <w:r>
         <w:rPr/>
-        <w:t xml:space="preserve"> 96,096,390 字节；</w:t>
+        <w:t xml:space="preserve">（final2 那一次 96,096,390 字节 —— 这个数字</w:t>
+      </w:r>
+    </w:p>
+    <w:p>
+      <w:pPr/>
+      <w:r>
+        <w:rPr/>
+        <w:t xml:space="preserve">不钉死，交付那次"只重拷文档"的打包会让它跟着文档的字节数走，要以包外实际文件为准）；</w:t>
       </w:r>
     </w:p>
     <w:p>
@@ -11276,7 +11286,129 @@
       </w:r>
       <w:r>
         <w:rPr/>
-        <w:t xml:space="preserve">（最后一次打包只重拷了文档，没动 </w:t>
+        <w:t xml:space="preserve">，差别只在逐腿耗时那一列。</w:t>
+      </w:r>
+    </w:p>
+    <w:p>
+      <w:pPr/>
+      <w:r>
+        <w:rPr/>
+        <w:t xml:space="preserve">但</w:t>
+      </w:r>
+      <w:r>
+        <w:rPr>
+          <w:b/>
+        </w:rPr>
+        <w:t xml:space="preserve">交付包里的编译产物不是上面那条 08:20:02.497Z 那一次 build 的字节</w:t>
+      </w:r>
+      <w:r>
+        <w:rPr/>
+        <w:t xml:space="preserve">：台面 B1 那条腿自己会从干净树跑</w:t>
+      </w:r>
+    </w:p>
+    <w:p>
+      <w:pPr/>
+      <w:r>
+        <w:rPr>
+          <w:rFonts w:ascii="Consolas" w:hAnsi="Consolas"/>
+          <w:sz w:val="19"/>
+        </w:rPr>
+        <w:t xml:space="preserve">npm run build</w:t>
+      </w:r>
+      <w:r>
+        <w:rPr/>
+        <w:t xml:space="preserve">（</w:t>
+      </w:r>
+      <w:r>
+        <w:rPr>
+          <w:rFonts w:ascii="Consolas" w:hAnsi="Consolas"/>
+          <w:sz w:val="19"/>
+        </w:rPr>
+        <w:t xml:space="preserve">scripts/run-gates.mjs:203</w:t>
+      </w:r>
+      <w:r>
+        <w:rPr/>
+        <w:t xml:space="preserve">），final2 那一遍因此在 08:27:39Z 重写了 </w:t>
+      </w:r>
+      <w:r>
+        <w:rPr>
+          <w:rFonts w:ascii="Consolas" w:hAnsi="Consolas"/>
+          <w:sz w:val="19"/>
+        </w:rPr>
+        <w:t xml:space="preserve">.next/</w:t>
+      </w:r>
+      <w:r>
+        <w:rPr/>
+        <w:t xml:space="preserve"> 与 </w:t>
+      </w:r>
+      <w:r>
+        <w:rPr>
+          <w:rFonts w:ascii="Consolas" w:hAnsi="Consolas"/>
+          <w:sz w:val="19"/>
+        </w:rPr>
+        <w:t xml:space="preserve">dist/</w:t>
+      </w:r>
+      <w:r>
+        <w:rPr/>
+        <w:t xml:space="preserve">，</w:t>
+      </w:r>
+    </w:p>
+    <w:p>
+      <w:pPr/>
+      <w:r>
+        <w:rPr/>
+        <w:t xml:space="preserve">而 Next 每次编译换一个随机 </w:t>
+      </w:r>
+      <w:r>
+        <w:rPr>
+          <w:rFonts w:ascii="Consolas" w:hAnsi="Consolas"/>
+          <w:sz w:val="19"/>
+        </w:rPr>
+        <w:t xml:space="preserve">BUILD_ID</w:t>
+      </w:r>
+      <w:r>
+        <w:rPr/>
+        <w:t xml:space="preserve"> —— 交付包里记的是 </w:t>
+      </w:r>
+      <w:r>
+        <w:rPr>
+          <w:rFonts w:ascii="Consolas" w:hAnsi="Consolas"/>
+          <w:sz w:val="19"/>
+        </w:rPr>
+        <w:t xml:space="preserve">nextBuildId=Bl3dissujagYIdmWjbGB2</w:t>
+      </w:r>
+      <w:r>
+        <w:rPr/>
+        <w:t xml:space="preserve">。</w:t>
+      </w:r>
+    </w:p>
+    <w:p>
+      <w:pPr/>
+      <w:r>
+        <w:rPr/>
+        <w:t xml:space="preserve">两份记录的源码戳是同一个 </w:t>
+      </w:r>
+      <w:r>
+        <w:rPr>
+          <w:rFonts w:ascii="Consolas" w:hAnsi="Consolas"/>
+          <w:sz w:val="19"/>
+        </w:rPr>
+        <w:t xml:space="preserve">2026-10-15T08:09:29.269Z</w:t>
+      </w:r>
+      <w:r>
+        <w:rPr/>
+        <w:t xml:space="preserve">（</w:t>
+      </w:r>
+      <w:r>
+        <w:rPr>
+          <w:rFonts w:ascii="Consolas" w:hAnsi="Consolas"/>
+          <w:sz w:val="19"/>
+        </w:rPr>
+        <w:t xml:space="preserve">sourceStamp()</w:t>
+      </w:r>
+      <w:r>
+        <w:rPr/>
+        <w:t xml:space="preserve"> 只算 </w:t>
       </w:r>
       <w:r>
         <w:rPr>
@@ -11287,14 +11419,78 @@
       </w:r>
       <w:r>
         <w:rPr/>
-        <w:t xml:space="preserve">），差别只在逐腿耗时那一列。</w:t>
-      </w:r>
-    </w:p>
-    <w:p>
-      <w:pPr/>
-      <w:r>
-        <w:rPr/>
-        <w:t xml:space="preserve">交付时还会再做一次"只重拷文档"的打包（</w:t>
+        <w:t xml:space="preserve"> 与配置文件，文档不进这个戳，</w:t>
+      </w:r>
+    </w:p>
+    <w:p>
+      <w:pPr/>
+      <w:r>
+        <w:rPr/>
+        <w:t xml:space="preserve">所以"只重拷文档"的打包不会被判定为过期），也就是说：</w:t>
+      </w:r>
+      <w:r>
+        <w:rPr>
+          <w:b/>
+        </w:rPr>
+        <w:t xml:space="preserve">同一份代码，编译了两次</w:t>
+      </w:r>
+      <w:r>
+        <w:rPr/>
+        <w:t xml:space="preserve">，台面认证的是第一次，</w:t>
+      </w:r>
+    </w:p>
+    <w:p>
+      <w:pPr/>
+      <w:r>
+        <w:rPr/>
+        <w:t xml:space="preserve">交付的是第二次。要分辨这两者只能靠包内 </w:t>
+      </w:r>
+      <w:r>
+        <w:rPr>
+          <w:rFonts w:ascii="Consolas" w:hAnsi="Consolas"/>
+          <w:sz w:val="19"/>
+        </w:rPr>
+        <w:t xml:space="preserve">build-info.json</w:t>
+      </w:r>
+      <w:r>
+        <w:rPr/>
+        <w:t xml:space="preserve">，正文不写交付那一次的 </w:t>
+      </w:r>
+      <w:r>
+        <w:rPr>
+          <w:rFonts w:ascii="Consolas" w:hAnsi="Consolas"/>
+          <w:sz w:val="19"/>
+        </w:rPr>
+        <w:t xml:space="preserve">builtAt</w:t>
+      </w:r>
+      <w:r>
+        <w:rPr/>
+        <w:t xml:space="preserve"> ——</w:t>
+      </w:r>
+    </w:p>
+    <w:p>
+      <w:pPr/>
+      <w:r>
+        <w:rPr/>
+        <w:t xml:space="preserve">每改一次文档就要重打包一次，把 </w:t>
+      </w:r>
+      <w:r>
+        <w:rPr>
+          <w:rFonts w:ascii="Consolas" w:hAnsi="Consolas"/>
+          <w:sz w:val="19"/>
+        </w:rPr>
+        <w:t xml:space="preserve">builtAt</w:t>
+      </w:r>
+      <w:r>
+        <w:rPr/>
+        <w:t xml:space="preserve"> 写进正文等于让这句话在自己脚下过期。</w:t>
+      </w:r>
+    </w:p>
+    <w:p>
+      <w:pPr/>
+      <w:r>
+        <w:rPr/>
+        <w:t xml:space="preserve">交付用的打包走 </w:t>
       </w:r>
       <w:r>
         <w:rPr>
@@ -11305,35 +11501,43 @@
       </w:r>
       <w:r>
         <w:rPr/>
-        <w:t xml:space="preserve">：源戳比产物旧就直接拒绝，且两条启动冒烟照样重跑），</w:t>
-      </w:r>
-    </w:p>
-    <w:p>
-      <w:pPr/>
-      <w:r>
-        <w:rPr/>
-        <w:t xml:space="preserve">其时间戳以</w:t>
-      </w:r>
-      <w:r>
-        <w:rPr>
-          <w:b/>
-        </w:rPr>
-        <w:t xml:space="preserve">包内</w:t>
-      </w:r>
-      <w:r>
-        <w:rPr/>
-        <w:t xml:space="preserve"> </w:t>
-      </w:r>
-      <w:r>
-        <w:rPr>
-          <w:rFonts w:ascii="Consolas" w:hAnsi="Consolas"/>
-          <w:sz w:val="19"/>
-        </w:rPr>
-        <w:t xml:space="preserve">release/build-info.json</w:t>
-      </w:r>
-      <w:r>
-        <w:rPr/>
-        <w:t xml:space="preserve"> 为准 —— 本报告不把它写死在正文里，免得文字比它自己描述的包更旧。</w:t>
+        <w:t xml:space="preserve">：产物比源码旧就直接拒绝（</w:t>
+      </w:r>
+      <w:r>
+        <w:rPr>
+          <w:rFonts w:ascii="Consolas" w:hAnsi="Consolas"/>
+          <w:sz w:val="19"/>
+        </w:rPr>
+        <w:t xml:space="preserve">scripts/build-release.mjs:138</w:t>
+      </w:r>
+      <w:r>
+        <w:rPr/>
+        <w:t xml:space="preserve">），</w:t>
+      </w:r>
+    </w:p>
+    <w:p>
+      <w:pPr/>
+      <w:r>
+        <w:rPr/>
+        <w:t xml:space="preserve">两条启动冒烟照样重跑 —— 最近这一次退 0，暂存树与解开的 tarball 各 10 条断言全过</w:t>
+      </w:r>
+    </w:p>
+    <w:p>
+      <w:pPr/>
+      <w:r>
+        <w:rPr/>
+        <w:t xml:space="preserve">（</w:t>
+      </w:r>
+      <w:r>
+        <w:rPr>
+          <w:rFonts w:ascii="Consolas" w:hAnsi="Consolas"/>
+          <w:sz w:val="19"/>
+        </w:rPr>
+        <w:t xml:space="preserve">scratch/release-docs-final.log</w:t>
+      </w:r>
+      <w:r>
+        <w:rPr/>
+        <w:t xml:space="preserve">）。</w:t>
       </w:r>
     </w:p>
     <w:p>

</xml_diff>

<commit_message>
docs: keep the commit-count claim from rotting under its own commit
The version-state paragraph named a number of docs commits, which the next docs
correction would have made false. It now describes the shape of the series instead.
</commit_message>
<xml_diff>
--- a/docs/TEST-REPORT.docx
+++ b/docs/TEST-REPORT.docx
@@ -11555,7 +11555,14 @@
       </w:r>
       <w:r>
         <w:rPr/>
-        <w:t xml:space="preserve"> 四条主提交，再加一条把本段状态写回报告的 </w:t>
+        <w:t xml:space="preserve"> 四条主提交，其后是把本段状态与</w:t>
+      </w:r>
+    </w:p>
+    <w:p>
+      <w:pPr/>
+      <w:r>
+        <w:rPr/>
+        <w:t xml:space="preserve">"认证的那次编译 vs 交付的那次编译"写回报告的若干条 </w:t>
       </w:r>
       <w:r>
         <w:rPr>
@@ -11566,14 +11573,7 @@
       </w:r>
       <w:r>
         <w:rPr/>
-        <w:t xml:space="preserve"> 提交，</w:t>
-      </w:r>
-    </w:p>
-    <w:p>
-      <w:pPr/>
-      <w:r>
-        <w:rPr/>
-        <w:t xml:space="preserve">注解标签 </w:t>
+        <w:t xml:space="preserve"> 提交，注解标签 </w:t>
       </w:r>
       <w:r>
         <w:rPr>
@@ -11584,7 +11584,7 @@
       </w:r>
       <w:r>
         <w:rPr/>
-        <w:t xml:space="preserve"> 打在最后这一条上（每条都用显式路径 </w:t>
+        <w:t xml:space="preserve"> 打在最后一条提交上（每条都用显式路径 </w:t>
       </w:r>
       <w:r>
         <w:rPr>

</xml_diff>